<commit_message>
changes to names plus some definitons
</commit_message>
<xml_diff>
--- a/PO lab6  zadanie do analizy i implemenatcji v1.docx
+++ b/PO lab6  zadanie do analizy i implemenatcji v1.docx
@@ -731,15 +731,13 @@
         <w:t xml:space="preserve">, stosowaniu związków pomiędzy klasami/obiektami (asocjacji, agregacji, kompozycji), a tym samym </w:t>
       </w:r>
       <w:r>
-        <w:t xml:space="preserve">o komunikacji między klasami/obiektami (wywoływaniu metod innych obiektów, wykorzystaniu argumentów wejściowych i odbieraniu argumentów wyjściowych do komunikacji, </w:t>
-      </w:r>
-      <w:proofErr w:type="spellStart"/>
-      <w:r>
-        <w:t>wtym</w:t>
-      </w:r>
-      <w:proofErr w:type="spellEnd"/>
-      <w:r>
-        <w:t xml:space="preserve"> zmianie stanów i wywoływania metod obiektów przesyłanych w parametrach (najlepiej jako wskaźnik/referencja). </w:t>
+        <w:t>o komunikacji między klasami/obiektami (wywoływaniu metod innych obiektów, wykorzystaniu argumentów wejściowych i odbieraniu argumentów wyjściowych do komunikacji, w</w:t>
+      </w:r>
+      <w:r>
+        <w:t xml:space="preserve"> </w:t>
+      </w:r>
+      <w:r>
+        <w:t xml:space="preserve">tym zmianie stanów i wywoływania metod obiektów przesyłanych w parametrach (najlepiej jako wskaźnik/referencja). </w:t>
       </w:r>
     </w:p>
     <w:p>
@@ -1254,13 +1252,27 @@
         <w:rPr>
           <w:highlight w:val="green"/>
         </w:rPr>
-        <w:t>komentarzach i zdjęciach,</w:t>
-      </w:r>
-      <w:r>
+        <w:t xml:space="preserve">komentarzach </w:t>
+      </w:r>
+      <w:r>
+        <w:rPr>
+          <w:i/>
+          <w:iCs/>
+          <w:highlight w:val="green"/>
+        </w:rPr>
+        <w:t>i zdjęciach,</w:t>
+      </w:r>
+      <w:r>
+        <w:rPr>
+          <w:i/>
+          <w:iCs/>
+        </w:rPr>
         <w:t xml:space="preserve"> tworzenia </w:t>
       </w:r>
       <w:r>
         <w:rPr>
+          <w:i/>
+          <w:iCs/>
           <w:highlight w:val="green"/>
         </w:rPr>
         <w:t>albumów fotograficznych</w:t>
@@ -7252,6 +7264,7 @@
   <w:style w:type="character" w:default="1" w:styleId="Domylnaczcionkaakapitu">
     <w:name w:val="Default Paragraph Font"/>
     <w:uiPriority w:val="1"/>
+    <w:semiHidden/>
     <w:unhideWhenUsed/>
   </w:style>
   <w:style w:type="table" w:default="1" w:styleId="Standardowy">
@@ -7900,23 +7913,6 @@
 </file>
 
 <file path=customXml/item1.xml><?xml version="1.0" encoding="utf-8"?>
-<p:properties xmlns:p="http://schemas.microsoft.com/office/2006/metadata/properties" xmlns:xsi="http://www.w3.org/2001/XMLSchema-instance" xmlns:pc="http://schemas.microsoft.com/office/infopath/2007/PartnerControls">
-  <documentManagement>
-    <ReferenceId xmlns="fd3f27a8-ad24-49d5-92fa-2c05663c6259" xsi:nil="true"/>
-  </documentManagement>
-</p:properties>
-</file>
-
-<file path=customXml/item2.xml><?xml version="1.0" encoding="utf-8"?>
-<?mso-contentType ?>
-<FormTemplates xmlns="http://schemas.microsoft.com/sharepoint/v3/contenttype/forms">
-  <Display>DocumentLibraryForm</Display>
-  <Edit>DocumentLibraryForm</Edit>
-  <New>DocumentLibraryForm</New>
-</FormTemplates>
-</file>
-
-<file path=customXml/item3.xml><?xml version="1.0" encoding="utf-8"?>
 <ct:contentTypeSchema xmlns:ct="http://schemas.microsoft.com/office/2006/metadata/contentType" xmlns:ma="http://schemas.microsoft.com/office/2006/metadata/properties/metaAttributes" ct:_="" ma:_="" ma:contentTypeName="Dokument" ma:contentTypeID="0x01010079CF38789B629C4AAA5F33600343C0A7" ma:contentTypeVersion="4" ma:contentTypeDescription="Utwórz nowy dokument." ma:contentTypeScope="" ma:versionID="03a7f6ca30ca43ef5470880c035ff45c">
   <xsd:schema xmlns:xsd="http://www.w3.org/2001/XMLSchema" xmlns:xs="http://www.w3.org/2001/XMLSchema" xmlns:p="http://schemas.microsoft.com/office/2006/metadata/properties" xmlns:ns2="fd3f27a8-ad24-49d5-92fa-2c05663c6259" targetNamespace="http://schemas.microsoft.com/office/2006/metadata/properties" ma:root="true" ma:fieldsID="c813fbdca954403d2538a81788f3b188" ns2:_="">
     <xsd:import namespace="fd3f27a8-ad24-49d5-92fa-2c05663c6259"/>
@@ -8060,29 +8056,28 @@
 </ct:contentTypeSchema>
 </file>
 
+<file path=customXml/item2.xml><?xml version="1.0" encoding="utf-8"?>
+<?mso-contentType ?>
+<FormTemplates xmlns="http://schemas.microsoft.com/sharepoint/v3/contenttype/forms">
+  <Display>DocumentLibraryForm</Display>
+  <Edit>DocumentLibraryForm</Edit>
+  <New>DocumentLibraryForm</New>
+</FormTemplates>
+</file>
+
+<file path=customXml/item3.xml><?xml version="1.0" encoding="utf-8"?>
+<p:properties xmlns:p="http://schemas.microsoft.com/office/2006/metadata/properties" xmlns:xsi="http://www.w3.org/2001/XMLSchema-instance" xmlns:pc="http://schemas.microsoft.com/office/infopath/2007/PartnerControls">
+  <documentManagement>
+    <ReferenceId xmlns="fd3f27a8-ad24-49d5-92fa-2c05663c6259" xsi:nil="true"/>
+  </documentManagement>
+</p:properties>
+</file>
+
 <file path=customXml/item4.xml><?xml version="1.0" encoding="utf-8"?>
 <b:Sources xmlns:b="http://schemas.openxmlformats.org/officeDocument/2006/bibliography" xmlns="http://schemas.openxmlformats.org/officeDocument/2006/bibliography" SelectedStyle="\APASixthEditionOfficeOnline.xsl" StyleName="APA" Version="6"/>
 </file>
 
 <file path=customXml/itemProps1.xml><?xml version="1.0" encoding="utf-8"?>
-<ds:datastoreItem xmlns:ds="http://schemas.openxmlformats.org/officeDocument/2006/customXml" ds:itemID="{22C5A530-C2DC-4E52-8F2F-B6FA6634DEE2}">
-  <ds:schemaRefs>
-    <ds:schemaRef ds:uri="http://schemas.microsoft.com/office/2006/metadata/properties"/>
-    <ds:schemaRef ds:uri="http://schemas.microsoft.com/office/infopath/2007/PartnerControls"/>
-    <ds:schemaRef ds:uri="fd3f27a8-ad24-49d5-92fa-2c05663c6259"/>
-  </ds:schemaRefs>
-</ds:datastoreItem>
-</file>
-
-<file path=customXml/itemProps2.xml><?xml version="1.0" encoding="utf-8"?>
-<ds:datastoreItem xmlns:ds="http://schemas.openxmlformats.org/officeDocument/2006/customXml" ds:itemID="{BA18345B-DA99-4ACD-88F0-B292052EDA1A}">
-  <ds:schemaRefs>
-    <ds:schemaRef ds:uri="http://schemas.microsoft.com/sharepoint/v3/contenttype/forms"/>
-  </ds:schemaRefs>
-</ds:datastoreItem>
-</file>
-
-<file path=customXml/itemProps3.xml><?xml version="1.0" encoding="utf-8"?>
 <ds:datastoreItem xmlns:ds="http://schemas.openxmlformats.org/officeDocument/2006/customXml" ds:itemID="{AF1A35D7-A49F-4DD2-81B1-B0C85B36FECD}">
   <ds:schemaRefs>
     <ds:schemaRef ds:uri="http://schemas.microsoft.com/office/2006/metadata/contentType"/>
@@ -8100,6 +8095,24 @@
 </ds:datastoreItem>
 </file>
 
+<file path=customXml/itemProps2.xml><?xml version="1.0" encoding="utf-8"?>
+<ds:datastoreItem xmlns:ds="http://schemas.openxmlformats.org/officeDocument/2006/customXml" ds:itemID="{BA18345B-DA99-4ACD-88F0-B292052EDA1A}">
+  <ds:schemaRefs>
+    <ds:schemaRef ds:uri="http://schemas.microsoft.com/sharepoint/v3/contenttype/forms"/>
+  </ds:schemaRefs>
+</ds:datastoreItem>
+</file>
+
+<file path=customXml/itemProps3.xml><?xml version="1.0" encoding="utf-8"?>
+<ds:datastoreItem xmlns:ds="http://schemas.openxmlformats.org/officeDocument/2006/customXml" ds:itemID="{22C5A530-C2DC-4E52-8F2F-B6FA6634DEE2}">
+  <ds:schemaRefs>
+    <ds:schemaRef ds:uri="http://schemas.microsoft.com/office/2006/metadata/properties"/>
+    <ds:schemaRef ds:uri="http://schemas.microsoft.com/office/infopath/2007/PartnerControls"/>
+    <ds:schemaRef ds:uri="fd3f27a8-ad24-49d5-92fa-2c05663c6259"/>
+  </ds:schemaRefs>
+</ds:datastoreItem>
+</file>
+
 <file path=customXml/itemProps4.xml><?xml version="1.0" encoding="utf-8"?>
 <ds:datastoreItem xmlns:ds="http://schemas.openxmlformats.org/officeDocument/2006/customXml" ds:itemID="{67DD6A7A-394A-4866-A2B0-CAB0D01B6CC8}">
   <ds:schemaRefs>

</xml_diff>